<commit_message>
docs(fpga-systems): correct pumice / STREAM harness tables against the RTL
- pumice Table 2.3: NUM_GEN = 4 write and 4 read generators (the default; no
  build overrides it).
- pumice Table 2.1 + Observability: debug_sram and dfi_mon_ram have no writer
  on this build (host access only; dfi_mon_ram is a placeholder).
- STREAM Table 2.2 + bus-meter bullet: 0x100-0x128 is unallocated; interface
  classification is read from the observers own register blocks
  (OBS_STAT_SEL / OBS_STAT_DATA) and the in-core perf CSRs.
- harness_csr.sv: five stale comments about the retired meter range and the
  compressor-stats offsets corrected (comments only; build-perf lint clean
  before and after).
Both PDFs rebuilt at v1.0.
</commit_message>
<xml_diff>
--- a/projects/fpga-systems/Genesys2/dma-ip/stream/docs/STREAM_FPGA_System_v1.0.docx
+++ b/projects/fpga-systems/Genesys2/dma-ip/stream/docs/STREAM_FPGA_System_v1.0.docx
@@ -160,7 +160,7 @@
             </w:rPr>
             <w:fldChar w:fldCharType="separate"/>
           </w:r>
-          <w:hyperlink w:anchor="__RefHeading___Toc2745_2287008086">
+          <w:hyperlink w:anchor="__RefHeading___Toc2762_1566708358">
             <w:r>
               <w:rPr>
                 <w:webHidden/>
@@ -181,7 +181,7 @@
             </w:tabs>
             <w:rPr/>
           </w:pPr>
-          <w:hyperlink w:anchor="__RefHeading___Toc2747_2287008086">
+          <w:hyperlink w:anchor="__RefHeading___Toc2764_1566708358">
             <w:r>
               <w:rPr>
                 <w:webHidden/>
@@ -202,7 +202,7 @@
             </w:tabs>
             <w:rPr/>
           </w:pPr>
-          <w:hyperlink w:anchor="__RefHeading___Toc2749_2287008086">
+          <w:hyperlink w:anchor="__RefHeading___Toc2766_1566708358">
             <w:r>
               <w:rPr>
                 <w:webHidden/>
@@ -223,7 +223,7 @@
             </w:tabs>
             <w:rPr/>
           </w:pPr>
-          <w:hyperlink w:anchor="__RefHeading___Toc2751_2287008086">
+          <w:hyperlink w:anchor="__RefHeading___Toc2768_1566708358">
             <w:r>
               <w:rPr>
                 <w:webHidden/>
@@ -244,7 +244,7 @@
             </w:tabs>
             <w:rPr/>
           </w:pPr>
-          <w:hyperlink w:anchor="__RefHeading___Toc2753_2287008086">
+          <w:hyperlink w:anchor="__RefHeading___Toc2770_1566708358">
             <w:r>
               <w:rPr>
                 <w:webHidden/>
@@ -265,7 +265,7 @@
             </w:tabs>
             <w:rPr/>
           </w:pPr>
-          <w:hyperlink w:anchor="__RefHeading___Toc2755_2287008086">
+          <w:hyperlink w:anchor="__RefHeading___Toc2772_1566708358">
             <w:r>
               <w:rPr>
                 <w:webHidden/>
@@ -286,7 +286,7 @@
             </w:tabs>
             <w:rPr/>
           </w:pPr>
-          <w:hyperlink w:anchor="__RefHeading___Toc2757_2287008086">
+          <w:hyperlink w:anchor="__RefHeading___Toc2774_1566708358">
             <w:r>
               <w:rPr>
                 <w:webHidden/>
@@ -307,7 +307,7 @@
             </w:tabs>
             <w:rPr/>
           </w:pPr>
-          <w:hyperlink w:anchor="__RefHeading___Toc2759_2287008086">
+          <w:hyperlink w:anchor="__RefHeading___Toc2776_1566708358">
             <w:r>
               <w:rPr>
                 <w:webHidden/>
@@ -328,7 +328,7 @@
             </w:tabs>
             <w:rPr/>
           </w:pPr>
-          <w:hyperlink w:anchor="__RefHeading___Toc2761_2287008086">
+          <w:hyperlink w:anchor="__RefHeading___Toc2778_1566708358">
             <w:r>
               <w:rPr>
                 <w:webHidden/>
@@ -349,7 +349,7 @@
             </w:tabs>
             <w:rPr/>
           </w:pPr>
-          <w:hyperlink w:anchor="__RefHeading___Toc2763_2287008086">
+          <w:hyperlink w:anchor="__RefHeading___Toc2780_1566708358">
             <w:r>
               <w:rPr>
                 <w:webHidden/>
@@ -370,7 +370,7 @@
             </w:tabs>
             <w:rPr/>
           </w:pPr>
-          <w:hyperlink w:anchor="__RefHeading___Toc2765_2287008086">
+          <w:hyperlink w:anchor="__RefHeading___Toc2782_1566708358">
             <w:r>
               <w:rPr>
                 <w:webHidden/>
@@ -391,7 +391,7 @@
             </w:tabs>
             <w:rPr/>
           </w:pPr>
-          <w:hyperlink w:anchor="__RefHeading___Toc2767_2287008086">
+          <w:hyperlink w:anchor="__RefHeading___Toc2784_1566708358">
             <w:r>
               <w:rPr>
                 <w:webHidden/>
@@ -412,7 +412,7 @@
             </w:tabs>
             <w:rPr/>
           </w:pPr>
-          <w:hyperlink w:anchor="__RefHeading___Toc2769_2287008086">
+          <w:hyperlink w:anchor="__RefHeading___Toc2786_1566708358">
             <w:r>
               <w:rPr>
                 <w:webHidden/>
@@ -433,7 +433,7 @@
             </w:tabs>
             <w:rPr/>
           </w:pPr>
-          <w:hyperlink w:anchor="__RefHeading___Toc2771_2287008086">
+          <w:hyperlink w:anchor="__RefHeading___Toc2788_1566708358">
             <w:r>
               <w:rPr>
                 <w:webHidden/>
@@ -454,7 +454,7 @@
             </w:tabs>
             <w:rPr/>
           </w:pPr>
-          <w:hyperlink w:anchor="__RefHeading___Toc2773_2287008086">
+          <w:hyperlink w:anchor="__RefHeading___Toc2790_1566708358">
             <w:r>
               <w:rPr>
                 <w:webHidden/>
@@ -462,7 +462,7 @@
               </w:rPr>
               <w:t>3.3 Stimulus and the memory model</w:t>
               <w:tab/>
-              <w:t>16</w:t>
+              <w:t>17</w:t>
             </w:r>
           </w:hyperlink>
         </w:p>
@@ -475,7 +475,7 @@
             </w:tabs>
             <w:rPr/>
           </w:pPr>
-          <w:hyperlink w:anchor="__RefHeading___Toc2775_2287008086">
+          <w:hyperlink w:anchor="__RefHeading___Toc2792_1566708358">
             <w:r>
               <w:rPr>
                 <w:webHidden/>
@@ -496,7 +496,7 @@
             </w:tabs>
             <w:rPr/>
           </w:pPr>
-          <w:hyperlink w:anchor="__RefHeading___Toc2777_2287008086">
+          <w:hyperlink w:anchor="__RefHeading___Toc2794_1566708358">
             <w:r>
               <w:rPr>
                 <w:webHidden/>
@@ -517,7 +517,7 @@
             </w:tabs>
             <w:rPr/>
           </w:pPr>
-          <w:hyperlink w:anchor="__RefHeading___Toc2779_2287008086">
+          <w:hyperlink w:anchor="__RefHeading___Toc2796_1566708358">
             <w:r>
               <w:rPr>
                 <w:webHidden/>
@@ -538,7 +538,7 @@
             </w:tabs>
             <w:rPr/>
           </w:pPr>
-          <w:hyperlink w:anchor="__RefHeading___Toc2781_2287008086">
+          <w:hyperlink w:anchor="__RefHeading___Toc2798_1566708358">
             <w:r>
               <w:rPr>
                 <w:webHidden/>
@@ -559,7 +559,7 @@
             </w:tabs>
             <w:rPr/>
           </w:pPr>
-          <w:hyperlink w:anchor="__RefHeading___Toc2783_2287008086">
+          <w:hyperlink w:anchor="__RefHeading___Toc2800_1566708358">
             <w:r>
               <w:rPr>
                 <w:webHidden/>
@@ -580,7 +580,7 @@
             </w:tabs>
             <w:rPr/>
           </w:pPr>
-          <w:hyperlink w:anchor="__RefHeading___Toc2785_2287008086">
+          <w:hyperlink w:anchor="__RefHeading___Toc2802_1566708358">
             <w:r>
               <w:rPr>
                 <w:webHidden/>
@@ -601,7 +601,7 @@
             </w:tabs>
             <w:rPr/>
           </w:pPr>
-          <w:hyperlink w:anchor="__RefHeading___Toc2787_2287008086">
+          <w:hyperlink w:anchor="__RefHeading___Toc2804_1566708358">
             <w:r>
               <w:rPr>
                 <w:webHidden/>
@@ -622,7 +622,7 @@
             </w:tabs>
             <w:rPr/>
           </w:pPr>
-          <w:hyperlink w:anchor="__RefHeading___Toc2789_2287008086">
+          <w:hyperlink w:anchor="__RefHeading___Toc2806_1566708358">
             <w:r>
               <w:rPr>
                 <w:webHidden/>
@@ -643,7 +643,7 @@
             </w:tabs>
             <w:rPr/>
           </w:pPr>
-          <w:hyperlink w:anchor="__RefHeading___Toc2791_2287008086">
+          <w:hyperlink w:anchor="__RefHeading___Toc2808_1566708358">
             <w:r>
               <w:rPr>
                 <w:webHidden/>
@@ -664,7 +664,7 @@
             </w:tabs>
             <w:rPr/>
           </w:pPr>
-          <w:hyperlink w:anchor="__RefHeading___Toc2793_2287008086">
+          <w:hyperlink w:anchor="__RefHeading___Toc2810_1566708358">
             <w:r>
               <w:rPr>
                 <w:webHidden/>
@@ -685,7 +685,7 @@
             </w:tabs>
             <w:rPr/>
           </w:pPr>
-          <w:hyperlink w:anchor="__RefHeading___Toc2795_2287008086">
+          <w:hyperlink w:anchor="__RefHeading___Toc2812_1566708358">
             <w:r>
               <w:rPr>
                 <w:webHidden/>
@@ -706,7 +706,7 @@
             </w:tabs>
             <w:rPr/>
           </w:pPr>
-          <w:hyperlink w:anchor="__RefHeading___Toc2797_2287008086">
+          <w:hyperlink w:anchor="__RefHeading___Toc2814_1566708358">
             <w:r>
               <w:rPr>
                 <w:webHidden/>
@@ -727,7 +727,7 @@
             </w:tabs>
             <w:rPr/>
           </w:pPr>
-          <w:hyperlink w:anchor="__RefHeading___Toc2799_2287008086">
+          <w:hyperlink w:anchor="__RefHeading___Toc2816_1566708358">
             <w:r>
               <w:rPr>
                 <w:webHidden/>
@@ -1420,7 +1420,7 @@
           <w:rPr>
             <w:rStyle w:val="ListLabel1"/>
           </w:rPr>
-          <w:t>16</w:t>
+          <w:t>17</w:t>
         </w:r>
         <w:r>
           <w:rPr>
@@ -2006,7 +2006,7 @@
         <w:spacing w:before="360" w:after="120"/>
         <w:rPr/>
       </w:pPr>
-      <w:bookmarkStart w:id="0" w:name="__RefHeading___Toc2745_2287008086"/>
+      <w:bookmarkStart w:id="0" w:name="__RefHeading___Toc2762_1566708358"/>
       <w:bookmarkStart w:id="1" w:name="document-information"/>
       <w:bookmarkEnd w:id="0"/>
       <w:r>
@@ -2596,7 +2596,7 @@
         <w:spacing w:before="280" w:after="80"/>
         <w:rPr/>
       </w:pPr>
-      <w:bookmarkStart w:id="3" w:name="__RefHeading___Toc2747_2287008086"/>
+      <w:bookmarkStart w:id="3" w:name="__RefHeading___Toc2764_1566708358"/>
       <w:bookmarkEnd w:id="3"/>
       <w:r>
         <w:rPr>
@@ -2868,7 +2868,7 @@
         <w:spacing w:before="280" w:after="80"/>
         <w:rPr/>
       </w:pPr>
-      <w:bookmarkStart w:id="5" w:name="__RefHeading___Toc2749_2287008086"/>
+      <w:bookmarkStart w:id="5" w:name="__RefHeading___Toc2766_1566708358"/>
       <w:bookmarkEnd w:id="5"/>
       <w:r>
         <w:rPr>
@@ -3024,7 +3024,7 @@
         <w:spacing w:before="360" w:after="120"/>
         <w:rPr/>
       </w:pPr>
-      <w:bookmarkStart w:id="7" w:name="__RefHeading___Toc2751_2287008086"/>
+      <w:bookmarkStart w:id="7" w:name="__RefHeading___Toc2768_1566708358"/>
       <w:bookmarkStart w:id="8" w:name="the-system"/>
       <w:bookmarkEnd w:id="7"/>
       <w:r>
@@ -3055,7 +3055,7 @@
         <w:spacing w:before="280" w:after="80"/>
         <w:rPr/>
       </w:pPr>
-      <w:bookmarkStart w:id="9" w:name="__RefHeading___Toc2753_2287008086"/>
+      <w:bookmarkStart w:id="9" w:name="__RefHeading___Toc2770_1566708358"/>
       <w:bookmarkStart w:id="10" w:name="what-it-is"/>
       <w:bookmarkEnd w:id="9"/>
       <w:r>
@@ -3107,7 +3107,7 @@
         <w:spacing w:before="200" w:after="80"/>
         <w:rPr/>
       </w:pPr>
-      <w:bookmarkStart w:id="11" w:name="__RefHeading___Toc2755_2287008086"/>
+      <w:bookmarkStart w:id="11" w:name="__RefHeading___Toc2772_1566708358"/>
       <w:bookmarkStart w:id="12" w:name="figure-1.1-the-bench"/>
       <w:bookmarkStart w:id="13" w:name="_Fig_1_The_bench"/>
       <w:bookmarkEnd w:id="11"/>
@@ -3226,7 +3226,7 @@
         <w:spacing w:before="280" w:after="80"/>
         <w:rPr/>
       </w:pPr>
-      <w:bookmarkStart w:id="14" w:name="__RefHeading___Toc2757_2287008086"/>
+      <w:bookmarkStart w:id="14" w:name="__RefHeading___Toc2774_1566708358"/>
       <w:bookmarkEnd w:id="14"/>
       <w:r>
         <w:rPr>
@@ -3864,7 +3864,7 @@
         <w:spacing w:before="280" w:after="80"/>
         <w:rPr/>
       </w:pPr>
-      <w:bookmarkStart w:id="17" w:name="__RefHeading___Toc2759_2287008086"/>
+      <w:bookmarkStart w:id="17" w:name="__RefHeading___Toc2776_1566708358"/>
       <w:bookmarkEnd w:id="17"/>
       <w:r>
         <w:rPr>
@@ -3971,7 +3971,7 @@
         <w:spacing w:before="280" w:after="80"/>
         <w:rPr/>
       </w:pPr>
-      <w:bookmarkStart w:id="18" w:name="__RefHeading___Toc2761_2287008086"/>
+      <w:bookmarkStart w:id="18" w:name="__RefHeading___Toc2778_1566708358"/>
       <w:bookmarkStart w:id="19" w:name="the-stack-top-to-bottom"/>
       <w:bookmarkEnd w:id="18"/>
       <w:r>
@@ -4514,7 +4514,7 @@
         <w:spacing w:before="280" w:after="80"/>
         <w:rPr/>
       </w:pPr>
-      <w:bookmarkStart w:id="21" w:name="__RefHeading___Toc2763_2287008086"/>
+      <w:bookmarkStart w:id="21" w:name="__RefHeading___Toc2780_1566708358"/>
       <w:bookmarkStart w:id="22" w:name="what-the-host-sees"/>
       <w:bookmarkEnd w:id="21"/>
       <w:r>
@@ -4660,7 +4660,7 @@
         <w:spacing w:before="360" w:after="120"/>
         <w:rPr/>
       </w:pPr>
-      <w:bookmarkStart w:id="25" w:name="__RefHeading___Toc2765_2287008086"/>
+      <w:bookmarkStart w:id="25" w:name="__RefHeading___Toc2782_1566708358"/>
       <w:bookmarkStart w:id="26" w:name="the-harness"/>
       <w:bookmarkEnd w:id="25"/>
       <w:r>
@@ -4707,7 +4707,7 @@
         <w:spacing w:before="200" w:after="80"/>
         <w:rPr/>
       </w:pPr>
-      <w:bookmarkStart w:id="27" w:name="__RefHeading___Toc2767_2287008086"/>
+      <w:bookmarkStart w:id="27" w:name="__RefHeading___Toc2784_1566708358"/>
       <w:bookmarkStart w:id="28" w:name="figure-2.1-the-harness-block-map"/>
       <w:bookmarkStart w:id="29" w:name="_Fig_2_The_harness_block_ma"/>
       <w:bookmarkEnd w:id="27"/>
@@ -4825,7 +4825,7 @@
         <w:spacing w:before="280" w:after="80"/>
         <w:rPr/>
       </w:pPr>
-      <w:bookmarkStart w:id="30" w:name="__RefHeading___Toc2769_2287008086"/>
+      <w:bookmarkStart w:id="30" w:name="__RefHeading___Toc2786_1566708358"/>
       <w:bookmarkStart w:id="31" w:name="the-host-front-end-and-the-bridge"/>
       <w:bookmarkEnd w:id="30"/>
       <w:r>
@@ -6444,7 +6444,7 @@
         <w:spacing w:before="280" w:after="80"/>
         <w:rPr/>
       </w:pPr>
-      <w:bookmarkStart w:id="33" w:name="__RefHeading___Toc2771_2287008086"/>
+      <w:bookmarkStart w:id="33" w:name="__RefHeading___Toc2788_1566708358"/>
       <w:bookmarkStart w:id="34" w:name="the-harness-csr"/>
       <w:bookmarkEnd w:id="33"/>
       <w:r>
@@ -7145,7 +7145,7 @@
                 <w:szCs w:val="24"/>
                 <w:lang w:val="en-US" w:eastAsia="en-US" w:bidi="ar-SA"/>
               </w:rPr>
-              <w:t>meter and count registers</w:t>
+              <w:t>(no meter registers)</w:t>
             </w:r>
           </w:p>
         </w:tc>
@@ -7170,13 +7170,83 @@
             </w:pPr>
             <w:r>
               <w:rPr>
-                <w:rFonts w:eastAsia="Cambria" w:cs=""/>
-                <w:kern w:val="0"/>
-                <w:sz w:val="24"/>
-                <w:szCs w:val="24"/>
-                <w:lang w:val="en-US" w:eastAsia="en-US" w:bidi="ar-SA"/>
-              </w:rPr>
-              <w:t>the per-interface cycle classification the perf host reads</w:t>
+                <w:rStyle w:val="VerbatimChar"/>
+                <w:rFonts w:eastAsia="Cambria" w:cs=""/>
+                <w:kern w:val="0"/>
+                <w:szCs w:val="24"/>
+                <w:lang w:val="en-US" w:eastAsia="en-US" w:bidi="ar-SA"/>
+              </w:rPr>
+              <w:t>0x100</w:t>
+            </w:r>
+            <w:r>
+              <w:rPr>
+                <w:rFonts w:eastAsia="Cambria" w:cs=""/>
+                <w:kern w:val="0"/>
+                <w:sz w:val="24"/>
+                <w:szCs w:val="24"/>
+                <w:lang w:val="en-US" w:eastAsia="en-US" w:bidi="ar-SA"/>
+              </w:rPr>
+              <w:t>-</w:t>
+            </w:r>
+            <w:r>
+              <w:rPr>
+                <w:rStyle w:val="VerbatimChar"/>
+                <w:rFonts w:eastAsia="Cambria" w:cs=""/>
+                <w:kern w:val="0"/>
+                <w:szCs w:val="24"/>
+                <w:lang w:val="en-US" w:eastAsia="en-US" w:bidi="ar-SA"/>
+              </w:rPr>
+              <w:t>0x128</w:t>
+            </w:r>
+            <w:r>
+              <w:rPr>
+                <w:rFonts w:eastAsia="Cambria" w:cs=""/>
+                <w:kern w:val="0"/>
+                <w:sz w:val="24"/>
+                <w:szCs w:val="24"/>
+                <w:lang w:val="en-US" w:eastAsia="en-US" w:bidi="ar-SA"/>
+              </w:rPr>
+              <w:t>, where the retired harness bus meters were read back, is unallocated; the per-interface cycle classification is read from the observers’ own register blocks (</w:t>
+            </w:r>
+            <w:r>
+              <w:rPr>
+                <w:rStyle w:val="VerbatimChar"/>
+                <w:rFonts w:eastAsia="Cambria" w:cs=""/>
+                <w:kern w:val="0"/>
+                <w:szCs w:val="24"/>
+                <w:lang w:val="en-US" w:eastAsia="en-US" w:bidi="ar-SA"/>
+              </w:rPr>
+              <w:t>OBS_STAT_SEL</w:t>
+            </w:r>
+            <w:r>
+              <w:rPr>
+                <w:rFonts w:eastAsia="Cambria" w:cs=""/>
+                <w:kern w:val="0"/>
+                <w:sz w:val="24"/>
+                <w:szCs w:val="24"/>
+                <w:lang w:val="en-US" w:eastAsia="en-US" w:bidi="ar-SA"/>
+              </w:rPr>
+              <w:t xml:space="preserve"> / </w:t>
+            </w:r>
+            <w:r>
+              <w:rPr>
+                <w:rStyle w:val="VerbatimChar"/>
+                <w:rFonts w:eastAsia="Cambria" w:cs=""/>
+                <w:kern w:val="0"/>
+                <w:szCs w:val="24"/>
+                <w:lang w:val="en-US" w:eastAsia="en-US" w:bidi="ar-SA"/>
+              </w:rPr>
+              <w:t>OBS_STAT_DATA</w:t>
+            </w:r>
+            <w:r>
+              <w:rPr>
+                <w:rFonts w:eastAsia="Cambria" w:cs=""/>
+                <w:kern w:val="0"/>
+                <w:sz w:val="24"/>
+                <w:szCs w:val="24"/>
+                <w:lang w:val="en-US" w:eastAsia="en-US" w:bidi="ar-SA"/>
+              </w:rPr>
+              <w:t>) and from STREAM’s in-core perf CSRs</w:t>
             </w:r>
           </w:p>
         </w:tc>
@@ -7211,7 +7281,7 @@
         <w:spacing w:before="280" w:after="80"/>
         <w:rPr/>
       </w:pPr>
-      <w:bookmarkStart w:id="36" w:name="__RefHeading___Toc2773_2287008086"/>
+      <w:bookmarkStart w:id="36" w:name="__RefHeading___Toc2790_1566708358"/>
       <w:bookmarkEnd w:id="36"/>
       <w:r>
         <w:rPr>
@@ -7597,7 +7667,7 @@
         <w:spacing w:before="280" w:after="80"/>
         <w:rPr/>
       </w:pPr>
-      <w:bookmarkStart w:id="39" w:name="__RefHeading___Toc2775_2287008086"/>
+      <w:bookmarkStart w:id="39" w:name="__RefHeading___Toc2792_1566708358"/>
       <w:bookmarkEnd w:id="39"/>
       <w:r>
         <w:rPr>
@@ -7648,7 +7718,17 @@
       </w:r>
       <w:r>
         <w:rPr/>
-        <w:t>, always built. Per interface, every cycle of the window is productive, backpressure, starvation or idle. They sit outside the monitor gate on purpose: the perf build has no monitor and must still count. That separation regressed once, when the gate over-reached and the perf build reported zeros, and the monitor test now asserts the meters are non-zero in that flavour.</w:t>
+        <w:t xml:space="preserve">, always built, inside the interface observers and STREAM’s in-core datapath (the harness’s own </w:t>
+      </w:r>
+      <w:r>
+        <w:rPr>
+          <w:rStyle w:val="VerbatimChar"/>
+        </w:rPr>
+        <w:t>axi_bus_meter</w:t>
+      </w:r>
+      <w:r>
+        <w:rPr/>
+        <w:t xml:space="preserve"> blocks are retired). Per interface, every cycle of the window is productive, backpressure, starvation or idle. They sit outside the monitor gate on purpose: the perf build has no monitor and must still count. That separation regressed once, when the gate over-reached and the perf build reported zeros, and the monitor test now asserts the meters are non-zero in that flavour.</w:t>
       </w:r>
     </w:p>
     <w:p>
@@ -7908,7 +7988,7 @@
         <w:spacing w:before="360" w:after="120"/>
         <w:rPr/>
       </w:pPr>
-      <w:bookmarkStart w:id="41" w:name="__RefHeading___Toc2777_2287008086"/>
+      <w:bookmarkStart w:id="41" w:name="__RefHeading___Toc2794_1566708358"/>
       <w:bookmarkStart w:id="42" w:name="one-rtl-three-builds"/>
       <w:bookmarkEnd w:id="41"/>
       <w:r>
@@ -7939,7 +8019,7 @@
         <w:spacing w:before="280" w:after="80"/>
         <w:rPr/>
       </w:pPr>
-      <w:bookmarkStart w:id="43" w:name="__RefHeading___Toc2779_2287008086"/>
+      <w:bookmarkStart w:id="43" w:name="__RefHeading___Toc2796_1566708358"/>
       <w:bookmarkStart w:id="44" w:name="the-rule"/>
       <w:bookmarkEnd w:id="43"/>
       <w:r>
@@ -8752,7 +8832,7 @@
         <w:spacing w:before="200" w:after="80"/>
         <w:rPr/>
       </w:pPr>
-      <w:bookmarkStart w:id="46" w:name="__RefHeading___Toc2781_2287008086"/>
+      <w:bookmarkStart w:id="46" w:name="__RefHeading___Toc2798_1566708358"/>
       <w:bookmarkStart w:id="47" w:name="Xc226b0c44a2c50f0e553011facdd3c0f482dd71"/>
       <w:bookmarkStart w:id="48" w:name="_Fig_3_One_source_tree__thr"/>
       <w:bookmarkEnd w:id="46"/>
@@ -8871,7 +8951,7 @@
         <w:spacing w:before="280" w:after="80"/>
         <w:rPr/>
       </w:pPr>
-      <w:bookmarkStart w:id="49" w:name="__RefHeading___Toc2783_2287008086"/>
+      <w:bookmarkStart w:id="49" w:name="__RefHeading___Toc2800_1566708358"/>
       <w:bookmarkStart w:id="50" w:name="why-three-and-why-not-two"/>
       <w:bookmarkEnd w:id="49"/>
       <w:r>
@@ -8953,7 +9033,7 @@
         <w:spacing w:before="280" w:after="80"/>
         <w:rPr/>
       </w:pPr>
-      <w:bookmarkStart w:id="52" w:name="__RefHeading___Toc2785_2287008086"/>
+      <w:bookmarkStart w:id="52" w:name="__RefHeading___Toc2802_1566708358"/>
       <w:bookmarkStart w:id="53" w:name="what-the-builds-measured"/>
       <w:bookmarkEnd w:id="52"/>
       <w:r>
@@ -9820,7 +9900,7 @@
         <w:spacing w:before="280" w:after="80"/>
         <w:rPr/>
       </w:pPr>
-      <w:bookmarkStart w:id="55" w:name="__RefHeading___Toc2787_2287008086"/>
+      <w:bookmarkStart w:id="55" w:name="__RefHeading___Toc2804_1566708358"/>
       <w:bookmarkStart w:id="56" w:name="the-knobs-behind-the-rows"/>
       <w:bookmarkEnd w:id="55"/>
       <w:r>
@@ -10819,7 +10899,7 @@
         <w:spacing w:before="360" w:after="120"/>
         <w:rPr/>
       </w:pPr>
-      <w:bookmarkStart w:id="60" w:name="__RefHeading___Toc2789_2287008086"/>
+      <w:bookmarkStart w:id="60" w:name="__RefHeading___Toc2806_1566708358"/>
       <w:bookmarkStart w:id="61" w:name="host-tools-and-flow"/>
       <w:bookmarkEnd w:id="60"/>
       <w:r>
@@ -10850,7 +10930,7 @@
         <w:spacing w:before="280" w:after="80"/>
         <w:rPr/>
       </w:pPr>
-      <w:bookmarkStart w:id="62" w:name="__RefHeading___Toc2791_2287008086"/>
+      <w:bookmarkStart w:id="62" w:name="__RefHeading___Toc2808_1566708358"/>
       <w:bookmarkEnd w:id="62"/>
       <w:r>
         <w:rPr>
@@ -11932,7 +12012,7 @@
         <w:spacing w:before="280" w:after="80"/>
         <w:rPr/>
       </w:pPr>
-      <w:bookmarkStart w:id="65" w:name="__RefHeading___Toc2793_2287008086"/>
+      <w:bookmarkStart w:id="65" w:name="__RefHeading___Toc2810_1566708358"/>
       <w:bookmarkEnd w:id="65"/>
       <w:r>
         <w:rPr>
@@ -12783,7 +12863,7 @@
         <w:spacing w:before="200" w:after="80"/>
         <w:rPr/>
       </w:pPr>
-      <w:bookmarkStart w:id="67" w:name="__RefHeading___Toc2795_2287008086"/>
+      <w:bookmarkStart w:id="67" w:name="__RefHeading___Toc2812_1566708358"/>
       <w:bookmarkStart w:id="68" w:name="Xd69c0e83a63449e03c27ce5d7596f669cc080e3"/>
       <w:bookmarkStart w:id="69" w:name="_Fig_4_What_each_build_meas"/>
       <w:bookmarkEnd w:id="67"/>
@@ -12901,7 +12981,7 @@
         <w:spacing w:before="280" w:after="80"/>
         <w:rPr/>
       </w:pPr>
-      <w:bookmarkStart w:id="70" w:name="__RefHeading___Toc2797_2287008086"/>
+      <w:bookmarkStart w:id="70" w:name="__RefHeading___Toc2814_1566708358"/>
       <w:bookmarkStart w:id="71" w:name="one-program-two-targets"/>
       <w:bookmarkEnd w:id="70"/>
       <w:r>
@@ -12971,7 +13051,7 @@
         <w:spacing w:before="280" w:after="80"/>
         <w:rPr/>
       </w:pPr>
-      <w:bookmarkStart w:id="73" w:name="__RefHeading___Toc2799_2287008086"/>
+      <w:bookmarkStart w:id="73" w:name="__RefHeading___Toc2816_1566708358"/>
       <w:bookmarkStart w:id="74" w:name="where-the-results-go"/>
       <w:bookmarkEnd w:id="73"/>
       <w:r>

</xml_diff>